<commit_message>
Add links that point to the github documents
</commit_message>
<xml_diff>
--- a/Documents/Presentation/Meeting Calendar/1 VHDL Syntax Review/MA1.docx
+++ b/Documents/Presentation/Meeting Calendar/1 VHDL Syntax Review/MA1.docx
@@ -504,12 +504,15 @@
                 <w:lang w:val="en-US"/>
               </w:rPr>
             </w:pPr>
-            <w:r>
-              <w:rPr>
-                <w:lang w:val="en-US"/>
-              </w:rPr>
-              <w:t>&lt;Link to actions list&gt;</w:t>
-            </w:r>
+            <w:hyperlink r:id="rId11" w:history="1">
+              <w:r>
+                <w:rPr>
+                  <w:rStyle w:val="Hyperlink"/>
+                  <w:lang w:val="en-US"/>
+                </w:rPr>
+                <w:t>HDL Review Notes</w:t>
+              </w:r>
+            </w:hyperlink>
           </w:p>
         </w:tc>
       </w:tr>
@@ -590,6 +593,15 @@
                 <w:lang w:val="en-US"/>
               </w:rPr>
             </w:pPr>
+            <w:hyperlink r:id="rId12" w:history="1">
+              <w:r>
+                <w:rPr>
+                  <w:rStyle w:val="Hyperlink"/>
+                  <w:lang w:val="en-US"/>
+                </w:rPr>
+                <w:t>HDL Review Notes</w:t>
+              </w:r>
+            </w:hyperlink>
           </w:p>
         </w:tc>
       </w:tr>
@@ -670,12 +682,15 @@
                 <w:lang w:val="en-US"/>
               </w:rPr>
             </w:pPr>
-            <w:r>
-              <w:rPr>
-                <w:lang w:val="en-US"/>
-              </w:rPr>
-              <w:t>N/A</w:t>
-            </w:r>
+            <w:hyperlink r:id="rId13" w:history="1">
+              <w:r>
+                <w:rPr>
+                  <w:rStyle w:val="Hyperlink"/>
+                  <w:lang w:val="en-US"/>
+                </w:rPr>
+                <w:t>HDL Review Notes</w:t>
+              </w:r>
+            </w:hyperlink>
           </w:p>
         </w:tc>
       </w:tr>
@@ -756,12 +771,15 @@
                 <w:lang w:val="en-US"/>
               </w:rPr>
             </w:pPr>
-            <w:r>
-              <w:rPr>
-                <w:lang w:val="en-US"/>
-              </w:rPr>
-              <w:t>N/A</w:t>
-            </w:r>
+            <w:hyperlink r:id="rId14" w:history="1">
+              <w:r>
+                <w:rPr>
+                  <w:rStyle w:val="Hyperlink"/>
+                  <w:lang w:val="en-US"/>
+                </w:rPr>
+                <w:t>HDL Review Notes</w:t>
+              </w:r>
+            </w:hyperlink>
           </w:p>
         </w:tc>
       </w:tr>
@@ -851,6 +869,15 @@
                 <w:lang w:val="en-US"/>
               </w:rPr>
             </w:pPr>
+            <w:hyperlink r:id="rId15" w:history="1">
+              <w:r>
+                <w:rPr>
+                  <w:rStyle w:val="Hyperlink"/>
+                  <w:lang w:val="en-US"/>
+                </w:rPr>
+                <w:t>HDL Review Notes</w:t>
+              </w:r>
+            </w:hyperlink>
           </w:p>
         </w:tc>
       </w:tr>
@@ -968,6 +995,12 @@
                 <w:lang w:val="en-US"/>
               </w:rPr>
             </w:pPr>
+            <w:r>
+              <w:rPr>
+                <w:lang w:val="en-US"/>
+              </w:rPr>
+              <w:t>N/A</w:t>
+            </w:r>
           </w:p>
         </w:tc>
       </w:tr>
@@ -989,8 +1022,17 @@
         <w:rPr>
           <w:lang w:val="en-US"/>
         </w:rPr>
-        <w:t>All actions are recorded here: &lt;insert link to Action Tracker&gt;</w:t>
-      </w:r>
+        <w:t xml:space="preserve">All actions are recorded here: </w:t>
+      </w:r>
+      <w:hyperlink r:id="rId16" w:history="1">
+        <w:r>
+          <w:rPr>
+            <w:rStyle w:val="Hyperlink"/>
+            <w:lang w:val="en-US"/>
+          </w:rPr>
+          <w:t>Action Tracker</w:t>
+        </w:r>
+      </w:hyperlink>
     </w:p>
     <w:p>
       <w:pPr>
@@ -1002,11 +1044,40 @@
         <w:rPr>
           <w:lang w:val="en-US"/>
         </w:rPr>
-        <w:t>All decisions and/or meeting minutes are stored here: &lt;insert link to Action Tracker&gt;</w:t>
-      </w:r>
+        <w:t xml:space="preserve">All decisions and/or meeting minutes are stored here: </w:t>
+      </w:r>
+      <w:hyperlink r:id="rId17" w:history="1">
+        <w:r>
+          <w:rPr>
+            <w:rStyle w:val="Hyperlink"/>
+            <w:lang w:val="en-US"/>
+          </w:rPr>
+          <w:t>Action Tracker</w:t>
+        </w:r>
+      </w:hyperlink>
+    </w:p>
+    <w:p>
+      <w:pPr>
+        <w:rPr>
+          <w:lang w:val="en-US"/>
+        </w:rPr>
+      </w:pPr>
+      <w:r>
+        <w:rPr>
+          <w:lang w:val="en-US"/>
+        </w:rPr>
+        <w:t>If any link is not available, please refer to the Action Tracker in the root directory, and the supporting files are put in the same folder hierarchy.</w:t>
+      </w:r>
+    </w:p>
+    <w:p>
+      <w:pPr>
+        <w:rPr>
+          <w:lang w:val="en-US"/>
+        </w:rPr>
+      </w:pPr>
     </w:p>
     <w:sectPr>
-      <w:footerReference w:type="default" r:id="rId11"/>
+      <w:footerReference w:type="default" r:id="rId18"/>
       <w:pgSz w:w="11906" w:h="16838"/>
       <w:pgMar w:top="720" w:right="720" w:bottom="720" w:left="720" w:header="708" w:footer="290" w:gutter="0"/>
       <w:cols w:space="708"/>
@@ -2349,6 +2420,41 @@
       <w:szCs w:val="26"/>
     </w:rPr>
   </w:style>
+  <w:style w:type="character" w:styleId="Hyperlink">
+    <w:name w:val="Hyperlink"/>
+    <w:basedOn w:val="DefaultParagraphFont"/>
+    <w:uiPriority w:val="99"/>
+    <w:unhideWhenUsed/>
+    <w:rsid w:val="00760059"/>
+    <w:rPr>
+      <w:color w:val="0563C1" w:themeColor="hyperlink"/>
+      <w:u w:val="single"/>
+    </w:rPr>
+  </w:style>
+  <w:style w:type="character" w:styleId="UnresolvedMention">
+    <w:name w:val="Unresolved Mention"/>
+    <w:basedOn w:val="DefaultParagraphFont"/>
+    <w:uiPriority w:val="99"/>
+    <w:semiHidden/>
+    <w:unhideWhenUsed/>
+    <w:rsid w:val="00760059"/>
+    <w:rPr>
+      <w:color w:val="605E5C"/>
+      <w:shd w:val="clear" w:color="auto" w:fill="E1DFDD"/>
+    </w:rPr>
+  </w:style>
+  <w:style w:type="character" w:styleId="FollowedHyperlink">
+    <w:name w:val="FollowedHyperlink"/>
+    <w:basedOn w:val="DefaultParagraphFont"/>
+    <w:uiPriority w:val="99"/>
+    <w:semiHidden/>
+    <w:unhideWhenUsed/>
+    <w:rsid w:val="00760059"/>
+    <w:rPr>
+      <w:color w:val="954F72" w:themeColor="followedHyperlink"/>
+      <w:u w:val="single"/>
+    </w:rPr>
+  </w:style>
 </w:styles>
 </file>
 

</xml_diff>